<commit_message>
Em-dashes verwijderd uit alle uitgaande documenten
Vervangen door reguliere streepjes of komma's (bij tussenzinnen).
Geldt voor email, KTLO-overeenkomst en infrastructuurmigratie-document.
</commit_message>
<xml_diff>
--- a/artifacts/Infrastructuurmigratie_Accountoverzicht_Dinck_BV.docx
+++ b/artifacts/Infrastructuurmigratie_Accountoverzicht_Dinck_BV.docx
@@ -408,7 +408,7 @@
           <w:sz w:val="24"/>
           <w:szCs w:val="24"/>
         </w:rPr>
-        <w:t xml:space="preserve">2. Huidige situatie — alle accounts</w:t>
+        <w:t xml:space="preserve">2. Huidige situatie - alle accounts</w:t>
       </w:r>
     </w:p>
     <w:p>
@@ -3317,7 +3317,7 @@
           <w:sz w:val="24"/>
           <w:szCs w:val="24"/>
         </w:rPr>
-        <w:t xml:space="preserve">3. Betaalmethoden Dinck B.V. — status</w:t>
+        <w:t xml:space="preserve">3. Betaalmethoden Dinck B.V. - status</w:t>
       </w:r>
     </w:p>
     <w:p>
@@ -4451,7 +4451,7 @@
                 <w:sz w:val="20"/>
                 <w:szCs w:val="20"/>
               </w:rPr>
-              <w:t xml:space="preserve">—</w:t>
+              <w:t xml:space="preserve">-</w:t>
             </w:r>
           </w:p>
         </w:tc>
@@ -6509,7 +6509,7 @@
                 <w:sz w:val="20"/>
                 <w:szCs w:val="20"/>
               </w:rPr>
-              <w:t xml:space="preserve">—</w:t>
+              <w:t xml:space="preserve">-</w:t>
             </w:r>
           </w:p>
         </w:tc>
@@ -6631,7 +6631,7 @@
                 <w:sz w:val="20"/>
                 <w:szCs w:val="20"/>
               </w:rPr>
-              <w:t xml:space="preserve">—</w:t>
+              <w:t xml:space="preserve">-</w:t>
             </w:r>
           </w:p>
         </w:tc>
@@ -6753,7 +6753,7 @@
                 <w:sz w:val="20"/>
                 <w:szCs w:val="20"/>
               </w:rPr>
-              <w:t xml:space="preserve">—</w:t>
+              <w:t xml:space="preserve">-</w:t>
             </w:r>
           </w:p>
         </w:tc>
@@ -7241,7 +7241,7 @@
                 <w:sz w:val="20"/>
                 <w:szCs w:val="20"/>
               </w:rPr>
-              <w:t xml:space="preserve">—</w:t>
+              <w:t xml:space="preserve">-</w:t>
             </w:r>
           </w:p>
         </w:tc>
@@ -7579,7 +7579,7 @@
           <w:sz w:val="22"/>
           <w:szCs w:val="22"/>
         </w:rPr>
-        <w:t xml:space="preserve">–  Hetzner — automatische incasso actief</w:t>
+        <w:t xml:space="preserve">–  Hetzner - automatische incasso actief</w:t>
       </w:r>
     </w:p>
     <w:p>
@@ -7593,7 +7593,7 @@
           <w:sz w:val="22"/>
           <w:szCs w:val="22"/>
         </w:rPr>
-        <w:t xml:space="preserve">–  Strato — automatische incasso actief</w:t>
+        <w:t xml:space="preserve">–  Strato - automatische incasso actief</w:t>
       </w:r>
     </w:p>
     <w:p>
@@ -7607,7 +7607,7 @@
           <w:sz w:val="22"/>
           <w:szCs w:val="22"/>
         </w:rPr>
-        <w:t xml:space="preserve">–  GitHub — dinckbv-organisatie bestaat, gratis plan voldoende</w:t>
+        <w:t xml:space="preserve">–  GitHub - dinckbv-organisatie bestaat, gratis plan voldoende</w:t>
       </w:r>
     </w:p>
     <w:p>
@@ -7621,7 +7621,7 @@
           <w:sz w:val="22"/>
           <w:szCs w:val="22"/>
         </w:rPr>
-        <w:t xml:space="preserve">–  MailPace — Peter regelt account, creditcard nodig</w:t>
+        <w:t xml:space="preserve">–  MailPace - Peter regelt account, creditcard nodig</w:t>
       </w:r>
     </w:p>
     <w:p>
@@ -7635,7 +7635,7 @@
           <w:sz w:val="22"/>
           <w:szCs w:val="22"/>
         </w:rPr>
-        <w:t xml:space="preserve">–  AppSignal — Peter regelt nieuw account</w:t>
+        <w:t xml:space="preserve">–  AppSignal - Peter regelt nieuw account</w:t>
       </w:r>
     </w:p>
     <w:p>

</xml_diff>

<commit_message>
AppSignal: Dinck B.V. organisatie reeds actief (geen nieuw account nodig)
</commit_message>
<xml_diff>
--- a/artifacts/Infrastructuurmigratie_Accountoverzicht_Dinck_BV.docx
+++ b/artifacts/Infrastructuurmigratie_Accountoverzicht_Dinck_BV.docx
@@ -358,7 +358,7 @@
           <w:sz w:val="22"/>
           <w:szCs w:val="22"/>
         </w:rPr>
-        <w:t xml:space="preserve">–  Bewaking (AppSignal → nieuw account op naam Dinck)</w:t>
+        <w:t xml:space="preserve">–  Bewaking (AppSignal, Dinck B.V. organisatie reeds actief)</w:t>
       </w:r>
     </w:p>
     <w:p>
@@ -3290,7 +3290,7 @@
                 <w:sz w:val="20"/>
                 <w:szCs w:val="20"/>
               </w:rPr>
-              <w:t xml:space="preserve">Nieuw account nodig</w:t>
+              <w:t xml:space="preserve">Dinck B.V. organisatie actief</w:t>
             </w:r>
           </w:p>
         </w:tc>
@@ -7635,7 +7635,7 @@
           <w:sz w:val="22"/>
           <w:szCs w:val="22"/>
         </w:rPr>
-        <w:t xml:space="preserve">–  AppSignal - Peter regelt nieuw account</w:t>
+        <w:t xml:space="preserve">–  AppSignal - Dinck B.V. organisatie actief (gratis plan)</w:t>
       </w:r>
     </w:p>
     <w:p>

</xml_diff>